<commit_message>
update ssh & mysql install
</commit_message>
<xml_diff>
--- a/doc/MySQL8.0資料庫安裝與設定.docx
+++ b/doc/MySQL8.0資料庫安裝與設定.docx
@@ -731,12 +731,24 @@
         <w:rPr>
           <w:rFonts w:eastAsiaTheme="minorEastAsia" w:hint="eastAsia"/>
         </w:rPr>
-        <w:t>若未設密碼可用</w:t>
+        <w:t>若未設密碼可</w:t>
       </w:r>
       <w:r>
         <w:rPr>
           <w:rFonts w:eastAsiaTheme="minorEastAsia" w:hint="eastAsia"/>
         </w:rPr>
+        <w:t>直接</w:t>
+      </w:r>
+      <w:r>
+        <w:rPr>
+          <w:rFonts w:eastAsiaTheme="minorEastAsia" w:hint="eastAsia"/>
+        </w:rPr>
+        <w:t>用</w:t>
+      </w:r>
+      <w:r>
+        <w:rPr>
+          <w:rFonts w:eastAsiaTheme="minorEastAsia" w:hint="eastAsia"/>
+        </w:rPr>
         <w:t xml:space="preserve">sudo  </w:t>
       </w:r>
       <w:r>
@@ -744,6 +756,12 @@
           <w:rFonts w:eastAsiaTheme="minorEastAsia"/>
         </w:rPr>
         <w:t>mysql</w:t>
+      </w:r>
+      <w:r>
+        <w:rPr>
+          <w:rFonts w:eastAsiaTheme="minorEastAsia" w:hint="eastAsia"/>
+        </w:rPr>
+        <w:t>登入</w:t>
       </w:r>
       <w:r>
         <w:rPr>
@@ -3811,7 +3829,67 @@
         <w:widowControl/>
         <w:rPr>
           <w:rFonts w:hint="eastAsia"/>
-        </w:rPr>
+          <w:b/>
+          <w:bCs/>
+        </w:rPr>
+      </w:pPr>
+      <w:r>
+        <w:rPr>
+          <w:rFonts w:hint="eastAsia"/>
+          <w:b/>
+          <w:bCs/>
+        </w:rPr>
+        <w:t>linux</w:t>
+      </w:r>
+      <w:r>
+        <w:rPr>
+          <w:rFonts w:hint="eastAsia"/>
+          <w:b/>
+          <w:bCs/>
+        </w:rPr>
+        <w:t>如果沒有流覽器</w:t>
+      </w:r>
+      <w:r>
+        <w:rPr>
+          <w:rFonts w:hint="eastAsia"/>
+          <w:b/>
+          <w:bCs/>
+        </w:rPr>
+        <w:t>(</w:t>
+      </w:r>
+      <w:r>
+        <w:rPr>
+          <w:rFonts w:hint="eastAsia"/>
+          <w:b/>
+          <w:bCs/>
+        </w:rPr>
+        <w:t>安裝</w:t>
+      </w:r>
+      <w:r>
+        <w:rPr>
+          <w:rFonts w:hint="eastAsia"/>
+          <w:b/>
+          <w:bCs/>
+        </w:rPr>
+        <w:t>firefox)</w:t>
+      </w:r>
+    </w:p>
+    <w:p>
+      <w:pPr>
+        <w:widowControl/>
+      </w:pPr>
+      <w:r>
+        <w:t>sudo apt install firefox</w:t>
+      </w:r>
+    </w:p>
+    <w:p>
+      <w:pPr>
+        <w:widowControl/>
+      </w:pPr>
+    </w:p>
+    <w:p>
+      <w:pPr>
+        <w:widowControl/>
       </w:pPr>
       <w:r>
         <w:rPr>
@@ -3993,6 +4071,7 @@
           <w:sz w:val="28"/>
           <w:szCs w:val="24"/>
         </w:rPr>
+        <w:lastRenderedPageBreak/>
         <w:t>安裝</w:t>
       </w:r>
       <w:r>
@@ -4036,64 +4115,100 @@
     <w:p>
       <w:pPr>
         <w:widowControl/>
-      </w:pPr>
-      <w:r>
-        <w:lastRenderedPageBreak/>
+        <w:rPr>
+          <w:color w:val="EE0000"/>
+        </w:rPr>
+      </w:pPr>
+      <w:r>
+        <w:rPr>
+          <w:color w:val="EE0000"/>
+        </w:rPr>
         <w:t>sudo apt install php-mysql</w:t>
       </w:r>
       <w:r>
         <w:rPr>
           <w:rFonts w:hint="eastAsia"/>
-        </w:rPr>
-        <w:t xml:space="preserve">  (php</w:t>
-      </w:r>
-      <w:r>
-        <w:rPr>
-          <w:rFonts w:hint="eastAsia"/>
-        </w:rPr>
-        <w:t>連接</w:t>
-      </w:r>
-      <w:r>
-        <w:rPr>
-          <w:rFonts w:hint="eastAsia"/>
-        </w:rPr>
-        <w:t>mysql</w:t>
-      </w:r>
-      <w:r>
-        <w:rPr>
-          <w:rFonts w:hint="eastAsia"/>
-        </w:rPr>
-        <w:t>的套件工具</w:t>
-      </w:r>
-      <w:r>
-        <w:rPr>
-          <w:rFonts w:hint="eastAsia"/>
-        </w:rPr>
-        <w:t>)</w:t>
-      </w:r>
-    </w:p>
-    <w:p>
-      <w:pPr>
-        <w:widowControl/>
-        <w:rPr>
+          <w:color w:val="EE0000"/>
+        </w:rPr>
+        <w:t xml:space="preserve">  (</w:t>
+      </w:r>
+      <w:r>
+        <w:rPr>
+          <w:rFonts w:hint="eastAsia"/>
           <w:b/>
           <w:bCs/>
-        </w:rPr>
-      </w:pPr>
+          <w:color w:val="EE0000"/>
+          <w:highlight w:val="yellow"/>
+        </w:rPr>
+        <w:t>記得</w:t>
+      </w:r>
       <w:r>
         <w:rPr>
           <w:rFonts w:hint="eastAsia"/>
           <w:b/>
           <w:bCs/>
-        </w:rPr>
-        <w:t>測試</w:t>
-      </w:r>
-      <w:r>
-        <w:rPr>
-          <w:rFonts w:hint="eastAsia"/>
+          <w:color w:val="EE0000"/>
+        </w:rPr>
+        <w:t>：</w:t>
+      </w:r>
+      <w:r>
+        <w:rPr>
+          <w:rFonts w:hint="eastAsia"/>
+          <w:color w:val="EE0000"/>
+        </w:rPr>
+        <w:t>php</w:t>
+      </w:r>
+      <w:r>
+        <w:rPr>
+          <w:rFonts w:hint="eastAsia"/>
+          <w:color w:val="EE0000"/>
+        </w:rPr>
+        <w:t>連接</w:t>
+      </w:r>
+      <w:r>
+        <w:rPr>
+          <w:rFonts w:hint="eastAsia"/>
+          <w:color w:val="EE0000"/>
+        </w:rPr>
+        <w:t>mysql</w:t>
+      </w:r>
+      <w:r>
+        <w:rPr>
+          <w:rFonts w:hint="eastAsia"/>
+          <w:color w:val="EE0000"/>
+        </w:rPr>
+        <w:t>的套件工具</w:t>
+      </w:r>
+      <w:r>
+        <w:rPr>
+          <w:rFonts w:hint="eastAsia"/>
+          <w:color w:val="EE0000"/>
+        </w:rPr>
+        <w:t>)</w:t>
+      </w:r>
+    </w:p>
+    <w:p>
+      <w:pPr>
+        <w:widowControl/>
+        <w:rPr>
           <w:b/>
           <w:bCs/>
         </w:rPr>
+      </w:pPr>
+      <w:r>
+        <w:rPr>
+          <w:rFonts w:hint="eastAsia"/>
+          <w:b/>
+          <w:bCs/>
+        </w:rPr>
+        <w:t>測試</w:t>
+      </w:r>
+      <w:r>
+        <w:rPr>
+          <w:rFonts w:hint="eastAsia"/>
+          <w:b/>
+          <w:bCs/>
+        </w:rPr>
         <w:t>php</w:t>
       </w:r>
     </w:p>
@@ -4195,13 +4310,22 @@
     <w:p>
       <w:pPr>
         <w:widowControl/>
-        <w:rPr>
+      </w:pPr>
+    </w:p>
+    <w:p>
+      <w:pPr>
+        <w:widowControl/>
+        <w:rPr>
+          <w:b/>
+          <w:bCs/>
           <w:color w:val="EE0000"/>
         </w:rPr>
       </w:pPr>
       <w:r>
         <w:rPr>
           <w:rFonts w:hint="eastAsia"/>
+          <w:b/>
+          <w:bCs/>
           <w:color w:val="EE0000"/>
         </w:rPr>
         <w:t>進入此設定介面後，可用</w:t>
@@ -4209,6 +4333,8 @@
       <w:r>
         <w:rPr>
           <w:rFonts w:hint="eastAsia"/>
+          <w:b/>
+          <w:bCs/>
           <w:color w:val="EE0000"/>
         </w:rPr>
         <w:t xml:space="preserve">tab </w:t>
@@ -4216,6 +4342,8 @@
       <w:r>
         <w:rPr>
           <w:rFonts w:hint="eastAsia"/>
+          <w:b/>
+          <w:bCs/>
           <w:color w:val="EE0000"/>
         </w:rPr>
         <w:t>和</w:t>
@@ -4223,6 +4351,8 @@
       <w:r>
         <w:rPr>
           <w:rFonts w:hint="eastAsia"/>
+          <w:b/>
+          <w:bCs/>
           <w:color w:val="EE0000"/>
         </w:rPr>
         <w:t xml:space="preserve"> </w:t>
@@ -4230,6 +4360,8 @@
       <w:r>
         <w:rPr>
           <w:rFonts w:hint="eastAsia"/>
+          <w:b/>
+          <w:bCs/>
           <w:color w:val="EE0000"/>
         </w:rPr>
         <w:t>空白鍵來操定設定</w:t>
@@ -4528,6 +4660,7 @@
         <w:rPr>
           <w:noProof/>
         </w:rPr>
+        <w:lastRenderedPageBreak/>
         <w:drawing>
           <wp:inline distT="0" distB="0" distL="0" distR="0" wp14:anchorId="59C5A8F9" wp14:editId="3CCFE649">
             <wp:extent cx="5274310" cy="1560195"/>
@@ -4586,7 +4719,6 @@
           <w:szCs w:val="72"/>
           <w:highlight w:val="yellow"/>
         </w:rPr>
-        <w:lastRenderedPageBreak/>
         <w:t>注意要記得做這動作：</w:t>
       </w:r>
     </w:p>
@@ -4949,6 +5081,7 @@
         <w:rPr>
           <w:noProof/>
         </w:rPr>
+        <w:lastRenderedPageBreak/>
         <w:drawing>
           <wp:inline distT="0" distB="0" distL="0" distR="0" wp14:anchorId="067F21BE" wp14:editId="6F62460D">
             <wp:extent cx="4500867" cy="3609473"/>
@@ -5075,7 +5208,6 @@
         <w:rPr>
           <w:rFonts w:asciiTheme="majorEastAsia" w:eastAsiaTheme="majorEastAsia" w:hAnsiTheme="majorEastAsia"/>
         </w:rPr>
-        <w:lastRenderedPageBreak/>
         <w:t>$cfg['Servers'][$i]['auth_type'] = '</w:t>
       </w:r>
       <w:r>
@@ -5414,7 +5546,6 @@
         <w:rPr>
           <w:noProof/>
         </w:rPr>
-        <w:lastRenderedPageBreak/>
         <w:drawing>
           <wp:inline distT="0" distB="0" distL="0" distR="0" wp14:anchorId="277E68F2" wp14:editId="799F2250">
             <wp:extent cx="5274310" cy="1495425"/>

</xml_diff>